<commit_message>
Update to V10: Pharmacovigilance-centered paper with new figures, supplementary files, and README
- Replaced old V9 ML-focused figures (Fig1-5) with V10 pharmacovigilance figures:
  * Fig1: Professional STROBE-compliant flowchart
  * Fig2: SOC distribution bar chart (23 categories, no 'Other' bar)
  * Fig3: Forest plots for metformin, atorvastatin, semaglutide (30 signals each)
  * Fig4: Forest plots for dapagliflozin, glargine, tirzepatide, empagliflozin
- Added new supplementary files:
  * S6: Predictor specification and data-leakage audit (17 features)
  * S7: Temporal dataset shift analysis (train/val/test metrics)
  * S8: Complete signal detection results (2,098 drug-event pairs, 677 signals)
  * S1 Fig: Detailed flowchart (PNG + EPS)
  * S2 Fig: SHAP feature importance (PNG + EPS)
- Updated README with study design, key findings, dataset description
- Removed old Striking_Image and Fig5 (not in V10)
- All ROR/CI values computed from actual FAERS data, no hardcoding
</commit_message>
<xml_diff>
--- a/Supplementary_Information/S1_Table_STROBE_Checklist.docx
+++ b/Supplementary_Information/S1_Table_STROBE_Checklist.docx
@@ -149,14 +149,8 @@
             <w:tcW w:type="dxa" w:w="2160"/>
           </w:tcPr>
           <w:p>
-            <w:r/>
             <w:r>
-              <w:rPr>
-                <w:rFonts w:ascii="Times New Roman" w:hAnsi="Times New Roman"/>
-                <w:b w:val="0"/>
-                <w:sz w:val="18"/>
-              </w:rPr>
-              <w:t>Title, Abstract (pp. 1–2)</w:t>
+              <w:t>Title, Abstract</w:t>
             </w:r>
           </w:p>
         </w:tc>
@@ -213,14 +207,8 @@
             <w:tcW w:type="dxa" w:w="2160"/>
           </w:tcPr>
           <w:p>
-            <w:r/>
             <w:r>
-              <w:rPr>
-                <w:rFonts w:ascii="Times New Roman" w:hAnsi="Times New Roman"/>
-                <w:b w:val="0"/>
-                <w:sz w:val="18"/>
-              </w:rPr>
-              <w:t>Abstract (p. 2)</w:t>
+              <w:t>Abstract</w:t>
             </w:r>
           </w:p>
         </w:tc>
@@ -342,14 +330,8 @@
             <w:tcW w:type="dxa" w:w="2160"/>
           </w:tcPr>
           <w:p>
-            <w:r/>
             <w:r>
-              <w:rPr>
-                <w:rFonts w:ascii="Times New Roman" w:hAnsi="Times New Roman"/>
-                <w:b w:val="0"/>
-                <w:sz w:val="18"/>
-              </w:rPr>
-              <w:t>Introduction (Section 2.1)</w:t>
+              <w:t>Introduction (Section 1)</w:t>
             </w:r>
           </w:p>
         </w:tc>
@@ -408,14 +390,8 @@
             <w:tcW w:type="dxa" w:w="2160"/>
           </w:tcPr>
           <w:p>
-            <w:r/>
             <w:r>
-              <w:rPr>
-                <w:rFonts w:ascii="Times New Roman" w:hAnsi="Times New Roman"/>
-                <w:b w:val="0"/>
-                <w:sz w:val="18"/>
-              </w:rPr>
-              <w:t>Introduction (Section 2.1, last paragraph)</w:t>
+              <w:t>Introduction (Section 1, final paragraph)</w:t>
             </w:r>
           </w:p>
         </w:tc>
@@ -537,14 +513,8 @@
             <w:tcW w:type="dxa" w:w="2160"/>
           </w:tcPr>
           <w:p>
-            <w:r/>
             <w:r>
-              <w:rPr>
-                <w:rFonts w:ascii="Times New Roman" w:hAnsi="Times New Roman"/>
-                <w:b w:val="0"/>
-                <w:sz w:val="18"/>
-              </w:rPr>
-              <w:t>Methods (Section 2.2)</w:t>
+              <w:t>Methods, Study Overview (Section 2.2)</w:t>
             </w:r>
           </w:p>
         </w:tc>
@@ -603,14 +573,8 @@
             <w:tcW w:type="dxa" w:w="2160"/>
           </w:tcPr>
           <w:p>
-            <w:r/>
             <w:r>
-              <w:rPr>
-                <w:rFonts w:ascii="Times New Roman" w:hAnsi="Times New Roman"/>
-                <w:b w:val="0"/>
-                <w:sz w:val="18"/>
-              </w:rPr>
-              <w:t>Methods (Section 2.3, Stage A–B)</w:t>
+              <w:t>Methods, Data Curation, Cohort Construction, and Preprocessing (Section 2.3)</w:t>
             </w:r>
           </w:p>
         </w:tc>
@@ -669,14 +633,8 @@
             <w:tcW w:type="dxa" w:w="2160"/>
           </w:tcPr>
           <w:p>
-            <w:r/>
             <w:r>
-              <w:rPr>
-                <w:rFonts w:ascii="Times New Roman" w:hAnsi="Times New Roman"/>
-                <w:b w:val="0"/>
-                <w:sz w:val="18"/>
-              </w:rPr>
-              <w:t>Methods (Section 2.3, Stage C)</w:t>
+              <w:t>Methods, Data Curation, Cohort Construction, and Preprocessing (Section 2.3)</w:t>
             </w:r>
           </w:p>
         </w:tc>
@@ -735,14 +693,8 @@
             <w:tcW w:type="dxa" w:w="2160"/>
           </w:tcPr>
           <w:p>
-            <w:r/>
             <w:r>
-              <w:rPr>
-                <w:rFonts w:ascii="Times New Roman" w:hAnsi="Times New Roman"/>
-                <w:b w:val="0"/>
-                <w:sz w:val="18"/>
-              </w:rPr>
-              <w:t>Methods (Section 2.3, Stages D–F); Table 3</w:t>
+              <w:t>Methods, Outcome Definition and Label Provenance / Predictors and Direct-Leakage Audit (Sections 2.3.1–2.3.2); Table 1</w:t>
             </w:r>
           </w:p>
         </w:tc>
@@ -801,14 +753,8 @@
             <w:tcW w:type="dxa" w:w="2160"/>
           </w:tcPr>
           <w:p>
-            <w:r/>
             <w:r>
-              <w:rPr>
-                <w:rFonts w:ascii="Times New Roman" w:hAnsi="Times New Roman"/>
-                <w:b w:val="0"/>
-                <w:sz w:val="18"/>
-              </w:rPr>
-              <w:t>Methods (Section 2.3, Stages A–F)</w:t>
+              <w:t>Methods, Data Curation, Cohort Construction, and Preprocessing (Section 2.3)</w:t>
             </w:r>
           </w:p>
         </w:tc>
@@ -867,14 +813,8 @@
             <w:tcW w:type="dxa" w:w="2160"/>
           </w:tcPr>
           <w:p>
-            <w:r/>
             <w:r>
-              <w:rPr>
-                <w:rFonts w:ascii="Times New Roman" w:hAnsi="Times New Roman"/>
-                <w:b w:val="0"/>
-                <w:sz w:val="18"/>
-              </w:rPr>
-              <w:t>Methods (Section 2.4, Leakage audit); Table 2</w:t>
+              <w:t>Methods, Predictors and Direct-Leakage Audit (Section 2.3.2); Leakage Sensitivity and Secondary Analyses (Section 2.4.2); Table 1</w:t>
             </w:r>
           </w:p>
         </w:tc>
@@ -933,14 +873,8 @@
             <w:tcW w:type="dxa" w:w="2160"/>
           </w:tcPr>
           <w:p>
-            <w:r/>
             <w:r>
-              <w:rPr>
-                <w:rFonts w:ascii="Times New Roman" w:hAnsi="Times New Roman"/>
-                <w:b w:val="0"/>
-                <w:sz w:val="18"/>
-              </w:rPr>
-              <w:t>Results (Section 3.1); Table 7</w:t>
+              <w:t>Results, Cohort Construction, Data Quality, and Outcome Availability (Section 3.1)</w:t>
             </w:r>
           </w:p>
         </w:tc>
@@ -999,14 +933,8 @@
             <w:tcW w:type="dxa" w:w="2160"/>
           </w:tcPr>
           <w:p>
-            <w:r/>
             <w:r>
-              <w:rPr>
-                <w:rFonts w:ascii="Times New Roman" w:hAnsi="Times New Roman"/>
-                <w:b w:val="0"/>
-                <w:sz w:val="18"/>
-              </w:rPr>
-              <w:t>Methods (Section 2.3, Stage F)</w:t>
+              <w:t>Methods, Missing Data and Encoding (Section 2.3.3)</w:t>
             </w:r>
           </w:p>
         </w:tc>
@@ -1065,14 +993,8 @@
             <w:tcW w:type="dxa" w:w="2160"/>
           </w:tcPr>
           <w:p>
-            <w:r/>
             <w:r>
-              <w:rPr>
-                <w:rFonts w:ascii="Times New Roman" w:hAnsi="Times New Roman"/>
-                <w:b w:val="0"/>
-                <w:sz w:val="18"/>
-              </w:rPr>
-              <w:t>Methods (Sections 2.5–2.8)</w:t>
+              <w:t>Methods, Evaluation, Explainability, and Statistical Analysis (Section 2.7)</w:t>
             </w:r>
           </w:p>
         </w:tc>
@@ -1129,14 +1051,8 @@
             <w:tcW w:type="dxa" w:w="2160"/>
           </w:tcPr>
           <w:p>
-            <w:r/>
             <w:r>
-              <w:rPr>
-                <w:rFonts w:ascii="Times New Roman" w:hAnsi="Times New Roman"/>
-                <w:b w:val="0"/>
-                <w:sz w:val="18"/>
-              </w:rPr>
-              <w:t>Methods (Section 2.8, Cohort sensitivity)</w:t>
+              <w:t>Results, Cohort-Definition Sensitivity (Section 3.6)</w:t>
             </w:r>
           </w:p>
         </w:tc>
@@ -1193,14 +1109,8 @@
             <w:tcW w:type="dxa" w:w="2160"/>
           </w:tcPr>
           <w:p>
-            <w:r/>
             <w:r>
-              <w:rPr>
-                <w:rFonts w:ascii="Times New Roman" w:hAnsi="Times New Roman"/>
-                <w:b w:val="0"/>
-                <w:sz w:val="18"/>
-              </w:rPr>
-              <w:t>Methods (Section 2.3, Stage F); Table 4</w:t>
+              <w:t>Methods, Missing Data and Encoding (Section 2.3.3)</w:t>
             </w:r>
           </w:p>
         </w:tc>
@@ -1257,14 +1167,8 @@
             <w:tcW w:type="dxa" w:w="2160"/>
           </w:tcPr>
           <w:p>
-            <w:r/>
             <w:r>
-              <w:rPr>
-                <w:rFonts w:ascii="Times New Roman" w:hAnsi="Times New Roman"/>
-                <w:b w:val="0"/>
-                <w:sz w:val="18"/>
-              </w:rPr>
-              <w:t>N/A (complete FAERS extraction)</w:t>
+              <w:t>N/A (complete FAERS extraction, not a drawn sample)</w:t>
             </w:r>
           </w:p>
         </w:tc>
@@ -1321,14 +1225,8 @@
             <w:tcW w:type="dxa" w:w="2160"/>
           </w:tcPr>
           <w:p>
-            <w:r/>
             <w:r>
-              <w:rPr>
-                <w:rFonts w:ascii="Times New Roman" w:hAnsi="Times New Roman"/>
-                <w:b w:val="0"/>
-                <w:sz w:val="18"/>
-              </w:rPr>
-              <w:t>Results (Sections 3.4–3.7)</w:t>
+              <w:t>Results, Secondary Random-Split Model Comparison / Temporal Dataset Shift / Cohort-Definition Sensitivity (Sections 3.4–3.6)</w:t>
             </w:r>
           </w:p>
         </w:tc>
@@ -1450,14 +1348,8 @@
             <w:tcW w:type="dxa" w:w="2160"/>
           </w:tcPr>
           <w:p>
-            <w:r/>
             <w:r>
-              <w:rPr>
-                <w:rFonts w:ascii="Times New Roman" w:hAnsi="Times New Roman"/>
-                <w:b w:val="0"/>
-                <w:sz w:val="18"/>
-              </w:rPr>
-              <w:t>Results (Section 3.1); Fig 2</w:t>
+              <w:t>Results, Cohort Construction, Data Quality, and Outcome Availability (Section 3.1); Fig 2</w:t>
             </w:r>
           </w:p>
         </w:tc>
@@ -1514,14 +1406,8 @@
             <w:tcW w:type="dxa" w:w="2160"/>
           </w:tcPr>
           <w:p>
-            <w:r/>
             <w:r>
-              <w:rPr>
-                <w:rFonts w:ascii="Times New Roman" w:hAnsi="Times New Roman"/>
-                <w:b w:val="0"/>
-                <w:sz w:val="18"/>
-              </w:rPr>
-              <w:t>Results (Section 3.1); Fig 2</w:t>
+              <w:t>Results, Cohort Construction, Data Quality, and Outcome Availability (Section 3.1); Fig 2</w:t>
             </w:r>
           </w:p>
         </w:tc>
@@ -1578,13 +1464,7 @@
             <w:tcW w:type="dxa" w:w="2160"/>
           </w:tcPr>
           <w:p>
-            <w:r/>
             <w:r>
-              <w:rPr>
-                <w:rFonts w:ascii="Times New Roman" w:hAnsi="Times New Roman"/>
-                <w:b w:val="0"/>
-                <w:sz w:val="18"/>
-              </w:rPr>
               <w:t>Fig 2; S1 Fig</w:t>
             </w:r>
           </w:p>
@@ -1644,14 +1524,8 @@
             <w:tcW w:type="dxa" w:w="2160"/>
           </w:tcPr>
           <w:p>
-            <w:r/>
             <w:r>
-              <w:rPr>
-                <w:rFonts w:ascii="Times New Roman" w:hAnsi="Times New Roman"/>
-                <w:b w:val="0"/>
-                <w:sz w:val="18"/>
-              </w:rPr>
-              <w:t>Results (Section 3.2); Table 8</w:t>
+              <w:t>Results, Cohort Construction, Data Quality, and Outcome Availability (Section 3.1); Table 2</w:t>
             </w:r>
           </w:p>
         </w:tc>
@@ -1708,14 +1582,8 @@
             <w:tcW w:type="dxa" w:w="2160"/>
           </w:tcPr>
           <w:p>
-            <w:r/>
             <w:r>
-              <w:rPr>
-                <w:rFonts w:ascii="Times New Roman" w:hAnsi="Times New Roman"/>
-                <w:b w:val="0"/>
-                <w:sz w:val="18"/>
-              </w:rPr>
-              <w:t>Table 4; Table 8</w:t>
+              <w:t>Table 2 (missingness rows)</w:t>
             </w:r>
           </w:p>
         </w:tc>
@@ -1774,14 +1642,8 @@
             <w:tcW w:type="dxa" w:w="2160"/>
           </w:tcPr>
           <w:p>
-            <w:r/>
             <w:r>
-              <w:rPr>
-                <w:rFonts w:ascii="Times New Roman" w:hAnsi="Times New Roman"/>
-                <w:b w:val="0"/>
-                <w:sz w:val="18"/>
-              </w:rPr>
-              <w:t>Results (Section 3.3); Table 10</w:t>
+              <w:t>Results, Cohort Construction, Data Quality, and Outcome Availability (Section 3.1); Table 8</w:t>
             </w:r>
           </w:p>
         </w:tc>
@@ -1840,14 +1702,8 @@
             <w:tcW w:type="dxa" w:w="2160"/>
           </w:tcPr>
           <w:p>
-            <w:r/>
             <w:r>
-              <w:rPr>
-                <w:rFonts w:ascii="Times New Roman" w:hAnsi="Times New Roman"/>
-                <w:b w:val="0"/>
-                <w:sz w:val="18"/>
-              </w:rPr>
-              <w:t>Results (Sections 3.4–3.8); Tables 11–22</w:t>
+              <w:t>Results, Primary Chronological Evaluation on Observed Outcomes (Section 3.2); Tables 3–4</w:t>
             </w:r>
           </w:p>
         </w:tc>
@@ -1904,14 +1760,8 @@
             <w:tcW w:type="dxa" w:w="2160"/>
           </w:tcPr>
           <w:p>
-            <w:r/>
             <w:r>
-              <w:rPr>
-                <w:rFonts w:ascii="Times New Roman" w:hAnsi="Times New Roman"/>
-                <w:b w:val="0"/>
-                <w:sz w:val="18"/>
-              </w:rPr>
-              <w:t>Methods (Section 2.3, Stage C)</w:t>
+              <w:t>Methods, Outcome Definition and Label Provenance (Section 2.3.1)</w:t>
             </w:r>
           </w:p>
         </w:tc>
@@ -1968,14 +1818,8 @@
             <w:tcW w:type="dxa" w:w="2160"/>
           </w:tcPr>
           <w:p>
-            <w:r/>
             <w:r>
-              <w:rPr>
-                <w:rFonts w:ascii="Times New Roman" w:hAnsi="Times New Roman"/>
-                <w:b w:val="0"/>
-                <w:sz w:val="18"/>
-              </w:rPr>
-              <w:t>Discussion (Section 4, Triage tool)</w:t>
+              <w:t>Results, Operational Utility: Risk Stratification and Triage (Section 3.2.1); Table 5</w:t>
             </w:r>
           </w:p>
         </w:tc>
@@ -2034,14 +1878,8 @@
             <w:tcW w:type="dxa" w:w="2160"/>
           </w:tcPr>
           <w:p>
-            <w:r/>
             <w:r>
-              <w:rPr>
-                <w:rFonts w:ascii="Times New Roman" w:hAnsi="Times New Roman"/>
-                <w:b w:val="0"/>
-                <w:sz w:val="18"/>
-              </w:rPr>
-              <w:t>Results (Sections 3.5–3.9)</w:t>
+              <w:t>Results, Sections 3.4–3.9</w:t>
             </w:r>
           </w:p>
         </w:tc>
@@ -2163,14 +2001,8 @@
             <w:tcW w:type="dxa" w:w="2160"/>
           </w:tcPr>
           <w:p>
-            <w:r/>
             <w:r>
-              <w:rPr>
-                <w:rFonts w:ascii="Times New Roman" w:hAnsi="Times New Roman"/>
-                <w:b w:val="0"/>
-                <w:sz w:val="18"/>
-              </w:rPr>
-              <w:t>Discussion (Section 4, para 1–2)</w:t>
+              <w:t>Discussion, Principal Findings (Section 4.1)</w:t>
             </w:r>
           </w:p>
         </w:tc>
@@ -2229,14 +2061,8 @@
             <w:tcW w:type="dxa" w:w="2160"/>
           </w:tcPr>
           <w:p>
-            <w:r/>
             <w:r>
-              <w:rPr>
-                <w:rFonts w:ascii="Times New Roman" w:hAnsi="Times New Roman"/>
-                <w:b w:val="0"/>
-                <w:sz w:val="18"/>
-              </w:rPr>
-              <w:t>Discussion (Section 4, Limitations)</w:t>
+              <w:t>Discussion, Strengths and Limitations (Section 4.6)</w:t>
             </w:r>
           </w:p>
         </w:tc>
@@ -2295,14 +2121,8 @@
             <w:tcW w:type="dxa" w:w="2160"/>
           </w:tcPr>
           <w:p>
-            <w:r/>
             <w:r>
-              <w:rPr>
-                <w:rFonts w:ascii="Times New Roman" w:hAnsi="Times New Roman"/>
-                <w:b w:val="0"/>
-                <w:sz w:val="18"/>
-              </w:rPr>
-              <w:t>Discussion (Section 4)</w:t>
+              <w:t>Discussion (Section 4, overall)</w:t>
             </w:r>
           </w:p>
         </w:tc>
@@ -2361,14 +2181,8 @@
             <w:tcW w:type="dxa" w:w="2160"/>
           </w:tcPr>
           <w:p>
-            <w:r/>
             <w:r>
-              <w:rPr>
-                <w:rFonts w:ascii="Times New Roman" w:hAnsi="Times New Roman"/>
-                <w:b w:val="0"/>
-                <w:sz w:val="18"/>
-              </w:rPr>
-              <w:t>Discussion (Section 4, Generalisability)</w:t>
+              <w:t>Discussion, Temporal Reliability and Cohort-Definition Sensitivity (Section 4.3)</w:t>
             </w:r>
           </w:p>
         </w:tc>
@@ -2490,14 +2304,8 @@
             <w:tcW w:type="dxa" w:w="2160"/>
           </w:tcPr>
           <w:p>
-            <w:r/>
             <w:r>
-              <w:rPr>
-                <w:rFonts w:ascii="Times New Roman" w:hAnsi="Times New Roman"/>
-                <w:b w:val="0"/>
-                <w:sz w:val="18"/>
-              </w:rPr>
-              <w:t>End matter (no external funding)</w:t>
+              <w:t>Financial Disclosure Statement (PLOS submission system; no external funding declared)</w:t>
             </w:r>
           </w:p>
         </w:tc>

</xml_diff>